<commit_message>
add new notes sections
</commit_message>
<xml_diff>
--- a/AWS/AWS Bedrock.docx
+++ b/AWS/AWS Bedrock.docx
@@ -56,32 +56,17 @@
         </w:numPr>
       </w:pPr>
       <w:r>
-        <w:t xml:space="preserve">We need a </w:t>
-      </w:r>
-      <w:proofErr w:type="spellStart"/>
-      <w:r>
-        <w:t>javascript</w:t>
-      </w:r>
-      <w:proofErr w:type="spellEnd"/>
-      <w:r>
-        <w:t xml:space="preserve"> </w:t>
-      </w:r>
-      <w:proofErr w:type="spellStart"/>
-      <w:r>
-        <w:t>sdk</w:t>
-      </w:r>
-      <w:proofErr w:type="spellEnd"/>
-      <w:r>
-        <w:t xml:space="preserve"> that lets us interact with AWS bedrock programmatically</w:t>
-      </w:r>
-      <w:r>
-        <w:t xml:space="preserve">; the equivalent of boto3 for </w:t>
-      </w:r>
-      <w:proofErr w:type="spellStart"/>
-      <w:r>
-        <w:t>javascript</w:t>
-      </w:r>
-      <w:proofErr w:type="spellEnd"/>
+        <w:t>We need a javascript sdk that lets us interact with AWS bedrock programmatically</w:t>
+      </w:r>
+      <w:r>
+        <w:t>; the equivalent of boto3 for javascript</w:t>
+      </w:r>
+      <w:r>
+        <w:t xml:space="preserve"> the equivalent is: </w:t>
+      </w:r>
+      <w:r>
+        <w:t>AWS SDK for JavaScript v3</w:t>
+      </w:r>
     </w:p>
     <w:p>
       <w:pPr>
@@ -104,7 +89,15 @@
         </w:numPr>
       </w:pPr>
       <w:r>
-        <w:t>We also define the system prompt into our code</w:t>
+        <w:t xml:space="preserve">We also define the </w:t>
+      </w:r>
+      <w:proofErr w:type="gramStart"/>
+      <w:r>
+        <w:t>system</w:t>
+      </w:r>
+      <w:proofErr w:type="gramEnd"/>
+      <w:r>
+        <w:t xml:space="preserve"> prompt into our code</w:t>
       </w:r>
     </w:p>
     <w:p>
@@ -152,15 +145,7 @@
         </w:numPr>
       </w:pPr>
       <w:r>
-        <w:t xml:space="preserve">Tool use with </w:t>
-      </w:r>
-      <w:proofErr w:type="spellStart"/>
-      <w:r>
-        <w:t>aws</w:t>
-      </w:r>
-      <w:proofErr w:type="spellEnd"/>
-      <w:r>
-        <w:t xml:space="preserve"> bedrock</w:t>
+        <w:t>Tool use with aws bedrock</w:t>
       </w:r>
       <w:r>
         <w:t xml:space="preserve"> tool use</w:t>
@@ -187,15 +172,7 @@
         </w:numPr>
       </w:pPr>
       <w:r>
-        <w:t xml:space="preserve">The model responding with </w:t>
-      </w:r>
-      <w:proofErr w:type="spellStart"/>
-      <w:r>
-        <w:t>tool_use</w:t>
-      </w:r>
-      <w:proofErr w:type="spellEnd"/>
-      <w:r>
-        <w:t xml:space="preserve"> </w:t>
+        <w:t xml:space="preserve">The model responding with tool_use </w:t>
       </w:r>
     </w:p>
     <w:p>
@@ -210,7 +187,15 @@
         <w:t xml:space="preserve">RAGs in bedrock: </w:t>
       </w:r>
       <w:r>
-        <w:t>before asking the model for an answer we first search our document for the relevant data</w:t>
+        <w:t xml:space="preserve">before asking the model for an answer we first </w:t>
+      </w:r>
+      <w:proofErr w:type="gramStart"/>
+      <w:r>
+        <w:t>search</w:t>
+      </w:r>
+      <w:proofErr w:type="gramEnd"/>
+      <w:r>
+        <w:t xml:space="preserve"> our document for the relevant data</w:t>
       </w:r>
       <w:r>
         <w:t>, that data will be included in the prompt that we will send to our model</w:t>
@@ -225,7 +210,23 @@
         </w:numPr>
       </w:pPr>
       <w:r>
-        <w:t>When we get the data we use semantic search which we search not using a keyword but we use the meaning of the data</w:t>
+        <w:t xml:space="preserve">When we get the </w:t>
+      </w:r>
+      <w:proofErr w:type="gramStart"/>
+      <w:r>
+        <w:t>data</w:t>
+      </w:r>
+      <w:proofErr w:type="gramEnd"/>
+      <w:r>
+        <w:t xml:space="preserve"> we use semantic search which we search not using a </w:t>
+      </w:r>
+      <w:proofErr w:type="gramStart"/>
+      <w:r>
+        <w:t>keyword</w:t>
+      </w:r>
+      <w:proofErr w:type="gramEnd"/>
+      <w:r>
+        <w:t xml:space="preserve"> but we use the meaning of the data</w:t>
       </w:r>
     </w:p>
     <w:p>
@@ -240,7 +241,15 @@
         <w:t xml:space="preserve">Bedrock knowledge basis: </w:t>
       </w:r>
       <w:r>
-        <w:t>we first create an S3 bucket to store the relevant data for the model</w:t>
+        <w:t xml:space="preserve">we first </w:t>
+      </w:r>
+      <w:proofErr w:type="gramStart"/>
+      <w:r>
+        <w:t>create</w:t>
+      </w:r>
+      <w:proofErr w:type="gramEnd"/>
+      <w:r>
+        <w:t xml:space="preserve"> an S3 bucket to store the relevant data for the model</w:t>
       </w:r>
     </w:p>
     <w:p>
@@ -264,7 +273,15 @@
         </w:numPr>
       </w:pPr>
       <w:r>
-        <w:t>For us to add a guardrail all we have to do is to add the guardrail ID to our API call</w:t>
+        <w:t xml:space="preserve">For us to add a guardrail all we </w:t>
+      </w:r>
+      <w:proofErr w:type="gramStart"/>
+      <w:r>
+        <w:t>have to</w:t>
+      </w:r>
+      <w:proofErr w:type="gramEnd"/>
+      <w:r>
+        <w:t xml:space="preserve"> do is to add the guardrail ID to our API call</w:t>
       </w:r>
       <w:r>
         <w:t>, and the guardrail version.</w:t>
@@ -1019,7 +1036,6 @@
   <w:style w:type="character" w:default="1" w:styleId="DefaultParagraphFont">
     <w:name w:val="Default Paragraph Font"/>
     <w:uiPriority w:val="1"/>
-    <w:semiHidden/>
     <w:unhideWhenUsed/>
   </w:style>
   <w:style w:type="table" w:default="1" w:styleId="TableNormal">

</xml_diff>